<commit_message>
Included a summary of how I utilized AI in my contributions.
</commit_message>
<xml_diff>
--- a/docs/phase2/ai-usage.docx
+++ b/docs/phase2/ai-usage.docx
@@ -48,7 +48,16 @@
         <w:t xml:space="preserve"> </w:t>
       </w:r>
       <w:r>
-        <w:t>Each team member was required to document their individual use of AI, including the specific prompts they used, as shown below.</w:t>
+        <w:t xml:space="preserve">Each team member </w:t>
+      </w:r>
+      <w:r>
+        <w:t>is</w:t>
+      </w:r>
+      <w:r>
+        <w:t xml:space="preserve"> required to document their individual use of AI, including the specific prompts they used, as shown below</w:t>
+      </w:r>
+      <w:r>
+        <w:t>:</w:t>
       </w:r>
     </w:p>
     <w:tbl>
@@ -404,6 +413,24 @@
                 <w:rFonts w:ascii="Times New Roman" w:hAnsi="Times New Roman" w:cs="Times New Roman"/>
               </w:rPr>
             </w:pPr>
+          </w:p>
+          <w:p>
+            <w:pPr>
+              <w:spacing w:line="480" w:lineRule="auto"/>
+              <w:jc w:val="center"/>
+              <w:rPr>
+                <w:rFonts w:ascii="Times New Roman" w:hAnsi="Times New Roman" w:cs="Times New Roman"/>
+              </w:rPr>
+            </w:pPr>
+          </w:p>
+          <w:p>
+            <w:pPr>
+              <w:spacing w:line="480" w:lineRule="auto"/>
+              <w:jc w:val="center"/>
+              <w:rPr>
+                <w:rFonts w:ascii="Times New Roman" w:hAnsi="Times New Roman" w:cs="Times New Roman"/>
+              </w:rPr>
+            </w:pPr>
             <w:r>
               <w:rPr>
                 <w:rFonts w:ascii="Times New Roman" w:hAnsi="Times New Roman" w:cs="Times New Roman"/>
@@ -442,6 +469,24 @@
                 <w:rFonts w:ascii="Times New Roman" w:hAnsi="Times New Roman" w:cs="Times New Roman"/>
               </w:rPr>
             </w:pPr>
+          </w:p>
+          <w:p>
+            <w:pPr>
+              <w:spacing w:line="480" w:lineRule="auto"/>
+              <w:jc w:val="center"/>
+              <w:rPr>
+                <w:rFonts w:ascii="Times New Roman" w:hAnsi="Times New Roman" w:cs="Times New Roman"/>
+              </w:rPr>
+            </w:pPr>
+          </w:p>
+          <w:p>
+            <w:pPr>
+              <w:spacing w:line="480" w:lineRule="auto"/>
+              <w:jc w:val="center"/>
+              <w:rPr>
+                <w:rFonts w:ascii="Times New Roman" w:hAnsi="Times New Roman" w:cs="Times New Roman"/>
+              </w:rPr>
+            </w:pPr>
             <w:r>
               <w:rPr>
                 <w:rFonts w:ascii="Times New Roman" w:hAnsi="Times New Roman" w:cs="Times New Roman"/>
@@ -456,12 +501,203 @@
           </w:tcPr>
           <w:p>
             <w:pPr>
-              <w:spacing w:line="480" w:lineRule="auto"/>
-              <w:jc w:val="center"/>
-              <w:rPr>
-                <w:rFonts w:ascii="Times New Roman" w:hAnsi="Times New Roman" w:cs="Times New Roman"/>
-              </w:rPr>
-            </w:pPr>
+              <w:pStyle w:val="ds-markdown-paragraph"/>
+              <w:shd w:val="clear" w:color="auto" w:fill="FFFFFF"/>
+              <w:spacing w:before="240" w:beforeAutospacing="0" w:after="240" w:afterAutospacing="0" w:line="276" w:lineRule="auto"/>
+              <w:rPr>
+                <w:color w:val="0F1115"/>
+              </w:rPr>
+            </w:pPr>
+            <w:r>
+              <w:rPr>
+                <w:rStyle w:val="Strong"/>
+                <w:rFonts w:eastAsiaTheme="majorEastAsia"/>
+                <w:color w:val="0F1115"/>
+              </w:rPr>
+              <w:t>Database Categories</w:t>
+            </w:r>
+            <w:r>
+              <w:rPr>
+                <w:color w:val="0F1115"/>
+              </w:rPr>
+              <w:br/>
+              <w:t xml:space="preserve">AI was used to generate an initial list of </w:t>
+            </w:r>
+            <w:r>
+              <w:rPr>
+                <w:color w:val="0F1115"/>
+              </w:rPr>
+              <w:t>Category_Name</w:t>
+            </w:r>
+            <w:r>
+              <w:rPr>
+                <w:color w:val="0F1115"/>
+              </w:rPr>
+              <w:t xml:space="preserve"> </w:t>
+            </w:r>
+            <w:r>
+              <w:rPr>
+                <w:color w:val="0F1115"/>
+              </w:rPr>
+              <w:t>(</w:t>
+            </w:r>
+            <w:r>
+              <w:rPr>
+                <w:color w:val="0F1115"/>
+              </w:rPr>
+              <w:t>table Categories</w:t>
+            </w:r>
+            <w:r>
+              <w:rPr>
+                <w:color w:val="0F1115"/>
+              </w:rPr>
+              <w:t>)</w:t>
+            </w:r>
+            <w:r>
+              <w:rPr>
+                <w:color w:val="0F1115"/>
+              </w:rPr>
+              <w:t xml:space="preserve"> since these need to be stored as </w:t>
+            </w:r>
+            <w:r>
+              <w:rPr>
+                <w:color w:val="0F1115"/>
+              </w:rPr>
+              <w:t>Enums</w:t>
+            </w:r>
+            <w:r>
+              <w:rPr>
+                <w:color w:val="0F1115"/>
+              </w:rPr>
+              <w:t xml:space="preserve"> in our database for future filtering. The AI provided more than 25 categories. After our team meeting on March 9th, we decided to regroup and shorten this list to make it more manageable while ensuring it remains useful for its purpose.</w:t>
+            </w:r>
+          </w:p>
+          <w:p>
+            <w:pPr>
+              <w:pStyle w:val="ds-markdown-paragraph"/>
+              <w:shd w:val="clear" w:color="auto" w:fill="FFFFFF"/>
+              <w:spacing w:before="240" w:beforeAutospacing="0" w:after="240" w:afterAutospacing="0" w:line="276" w:lineRule="auto"/>
+              <w:rPr>
+                <w:color w:val="0F1115"/>
+              </w:rPr>
+            </w:pPr>
+            <w:r>
+              <w:rPr>
+                <w:color w:val="0F1115"/>
+              </w:rPr>
+              <w:t xml:space="preserve">AI also used to create the list of </w:t>
+            </w:r>
+            <w:r>
+              <w:rPr>
+                <w:color w:val="0F1115"/>
+              </w:rPr>
+              <w:t>Income_Source</w:t>
+            </w:r>
+            <w:r>
+              <w:rPr>
+                <w:color w:val="0F1115"/>
+              </w:rPr>
+              <w:t xml:space="preserve"> </w:t>
+            </w:r>
+            <w:r>
+              <w:rPr>
+                <w:color w:val="0F1115"/>
+              </w:rPr>
+              <w:t>(</w:t>
+            </w:r>
+            <w:r>
+              <w:rPr>
+                <w:color w:val="0F1115"/>
+              </w:rPr>
+              <w:t>table Incomes</w:t>
+            </w:r>
+            <w:r>
+              <w:rPr>
+                <w:color w:val="0F1115"/>
+              </w:rPr>
+              <w:t>)</w:t>
+            </w:r>
+            <w:r>
+              <w:rPr>
+                <w:color w:val="0F1115"/>
+              </w:rPr>
+              <w:t xml:space="preserve"> with 24 different Source of income.</w:t>
+            </w:r>
+          </w:p>
+          <w:p>
+            <w:pPr>
+              <w:pStyle w:val="ds-markdown-paragraph"/>
+              <w:shd w:val="clear" w:color="auto" w:fill="FFFFFF"/>
+              <w:spacing w:before="240" w:beforeAutospacing="0" w:after="240" w:afterAutospacing="0" w:line="276" w:lineRule="auto"/>
+              <w:rPr>
+                <w:color w:val="0F1115"/>
+              </w:rPr>
+            </w:pPr>
+            <w:r>
+              <w:rPr>
+                <w:rStyle w:val="Strong"/>
+                <w:rFonts w:eastAsiaTheme="majorEastAsia"/>
+                <w:color w:val="0F1115"/>
+              </w:rPr>
+              <w:lastRenderedPageBreak/>
+              <w:t>Logo Design</w:t>
+            </w:r>
+            <w:r>
+              <w:rPr>
+                <w:color w:val="0F1115"/>
+              </w:rPr>
+              <w:br/>
+              <w:t>AI generate</w:t>
+            </w:r>
+            <w:r>
+              <w:rPr>
+                <w:color w:val="0F1115"/>
+              </w:rPr>
+              <w:t>d</w:t>
+            </w:r>
+            <w:r>
+              <w:rPr>
+                <w:color w:val="0F1115"/>
+              </w:rPr>
+              <w:t xml:space="preserve"> 8 different logo concepts for inspiration. The prompt included the app's main purpose, name, and slogan to guide the generation process.</w:t>
+            </w:r>
+          </w:p>
+          <w:p>
+            <w:pPr>
+              <w:pStyle w:val="ds-markdown-paragraph"/>
+              <w:shd w:val="clear" w:color="auto" w:fill="FFFFFF"/>
+              <w:spacing w:before="240" w:beforeAutospacing="0" w:after="240" w:afterAutospacing="0" w:line="276" w:lineRule="auto"/>
+              <w:rPr>
+                <w:color w:val="0F1115"/>
+              </w:rPr>
+            </w:pPr>
+            <w:r>
+              <w:rPr>
+                <w:rStyle w:val="Strong"/>
+                <w:rFonts w:eastAsiaTheme="majorEastAsia"/>
+                <w:color w:val="0F1115"/>
+              </w:rPr>
+              <w:t>Writing Assistance</w:t>
+            </w:r>
+            <w:r>
+              <w:rPr>
+                <w:color w:val="0F1115"/>
+              </w:rPr>
+              <w:br/>
+              <w:t xml:space="preserve">AI helped polish and correct </w:t>
+            </w:r>
+            <w:r>
+              <w:rPr>
+                <w:color w:val="0F1115"/>
+              </w:rPr>
+              <w:t>my</w:t>
+            </w:r>
+            <w:r>
+              <w:rPr>
+                <w:color w:val="0F1115"/>
+              </w:rPr>
+              <w:t xml:space="preserve"> written content to ensure clear communication with both teammates and our professor.</w:t>
+            </w:r>
           </w:p>
         </w:tc>
       </w:tr>
@@ -1454,6 +1690,7 @@
   <w:style w:type="character" w:default="1" w:styleId="DefaultParagraphFont">
     <w:name w:val="Default Paragraph Font"/>
     <w:uiPriority w:val="1"/>
+    <w:semiHidden/>
     <w:unhideWhenUsed/>
   </w:style>
   <w:style w:type="table" w:default="1" w:styleId="TableNormal">
@@ -1801,6 +2038,30 @@
         <w:insideV w:val="single" w:sz="4" w:space="0" w:color="auto"/>
       </w:tblBorders>
     </w:tblPr>
+  </w:style>
+  <w:style w:type="paragraph" w:customStyle="1" w:styleId="ds-markdown-paragraph">
+    <w:name w:val="ds-markdown-paragraph"/>
+    <w:basedOn w:val="Normal"/>
+    <w:rsid w:val="00F9361A"/>
+    <w:pPr>
+      <w:spacing w:before="100" w:beforeAutospacing="1" w:after="100" w:afterAutospacing="1" w:line="240" w:lineRule="auto"/>
+    </w:pPr>
+    <w:rPr>
+      <w:rFonts w:ascii="Times New Roman" w:eastAsia="Times New Roman" w:hAnsi="Times New Roman" w:cs="Times New Roman"/>
+      <w:kern w:val="0"/>
+      <w14:ligatures w14:val="none"/>
+    </w:rPr>
+  </w:style>
+  <w:style w:type="character" w:styleId="Strong">
+    <w:name w:val="Strong"/>
+    <w:basedOn w:val="DefaultParagraphFont"/>
+    <w:uiPriority w:val="22"/>
+    <w:qFormat/>
+    <w:rsid w:val="00F9361A"/>
+    <w:rPr>
+      <w:b/>
+      <w:bCs/>
+    </w:rPr>
   </w:style>
 </w:styles>
 </file>

</xml_diff>

<commit_message>
Completion of duration estimate
Completed the duration estimate document. Since AI was used to assist, I also added the needed information to the AI usage document.
</commit_message>
<xml_diff>
--- a/docs/phase2/ai-usage.docx
+++ b/docs/phase2/ai-usage.docx
@@ -201,11 +201,17 @@
           <w:p>
             <w:pPr>
               <w:spacing w:after="0" w:line="480" w:lineRule="auto"/>
-              <w:jc w:val="center"/>
-              <w:rPr>
-                <w:rFonts w:ascii="Times New Roman" w:hAnsi="Times New Roman" w:cs="Times New Roman"/>
-              </w:rPr>
-            </w:pPr>
+              <w:ind w:firstLine="246"/>
+              <w:rPr>
+                <w:rFonts w:ascii="Times New Roman" w:hAnsi="Times New Roman" w:cs="Times New Roman"/>
+              </w:rPr>
+            </w:pPr>
+            <w:r>
+              <w:rPr>
+                <w:rFonts w:ascii="Times New Roman" w:hAnsi="Times New Roman" w:cs="Times New Roman"/>
+              </w:rPr>
+              <w:t xml:space="preserve">AI was used to assist with understanding how to create the duration estimate document. Perplexity provided the PERT formula to calculate the estimated date. It also explained what should be in the contents of every column. </w:t>
+            </w:r>
           </w:p>
         </w:tc>
       </w:tr>
@@ -440,12 +446,28 @@
                 <w:rFonts w:ascii="Times New Roman" w:hAnsi="Times New Roman" w:cs="Times New Roman"/>
               </w:rPr>
             </w:pPr>
+            <w:proofErr w:type="spellStart"/>
             <w:r>
               <w:rPr>
                 <w:rFonts w:ascii="Times New Roman" w:eastAsia="Aptos" w:hAnsi="Times New Roman" w:cs="Times New Roman"/>
               </w:rPr>
-              <w:t>Roumaysae Jerari</w:t>
-            </w:r>
+              <w:t>Roumaysae</w:t>
+            </w:r>
+            <w:proofErr w:type="spellEnd"/>
+            <w:r>
+              <w:rPr>
+                <w:rFonts w:ascii="Times New Roman" w:eastAsia="Aptos" w:hAnsi="Times New Roman" w:cs="Times New Roman"/>
+              </w:rPr>
+              <w:t xml:space="preserve"> </w:t>
+            </w:r>
+            <w:proofErr w:type="spellStart"/>
+            <w:r>
+              <w:rPr>
+                <w:rFonts w:ascii="Times New Roman" w:eastAsia="Aptos" w:hAnsi="Times New Roman" w:cs="Times New Roman"/>
+              </w:rPr>
+              <w:t>Jerari</w:t>
+            </w:r>
+            <w:proofErr w:type="spellEnd"/>
           </w:p>
           <w:p>
             <w:pPr>
@@ -530,7 +552,42 @@
                 <w:color w:val="0F1115"/>
               </w:rPr>
               <w:br/>
-              <w:t>AI was used to generate an initial list of Category_Name (table Categories) since these need to be stored as Enums in our database for future filtering. The AI provided more than 25 categories. After our team meeting on March 9th, we decided to regroup and shorten this list to make it more manageable while ensuring it remains useful for its purpose.</w:t>
+              <w:t xml:space="preserve">AI was used to generate an initial list of </w:t>
+            </w:r>
+            <w:proofErr w:type="spellStart"/>
+            <w:r>
+              <w:rPr>
+                <w:color w:val="0F1115"/>
+              </w:rPr>
+              <w:t>Category_Name</w:t>
+            </w:r>
+            <w:proofErr w:type="spellEnd"/>
+            <w:r>
+              <w:rPr>
+                <w:color w:val="0F1115"/>
+              </w:rPr>
+              <w:t xml:space="preserve"> (table Categories) since these need to be stored as Enums in our database for future filtering. </w:t>
+            </w:r>
+            <w:proofErr w:type="gramStart"/>
+            <w:r>
+              <w:rPr>
+                <w:color w:val="0F1115"/>
+              </w:rPr>
+              <w:t>The AI</w:t>
+            </w:r>
+            <w:proofErr w:type="gramEnd"/>
+            <w:r>
+              <w:rPr>
+                <w:color w:val="0F1115"/>
+              </w:rPr>
+              <w:t xml:space="preserve"> provided more than 25 categories. After our team meeting on March 9th, we decided to </w:t>
+            </w:r>
+            <w:r>
+              <w:rPr>
+                <w:color w:val="0F1115"/>
+              </w:rPr>
+              <w:lastRenderedPageBreak/>
+              <w:t>regroup and shorten this list to make it more manageable while ensuring it remains useful for its purpose.</w:t>
             </w:r>
           </w:p>
           <w:p>
@@ -546,8 +603,21 @@
               <w:rPr>
                 <w:color w:val="0F1115"/>
               </w:rPr>
-              <w:lastRenderedPageBreak/>
-              <w:t>AI also used to create the list of Income_Source (table Incomes) with 24 different Source of income.</w:t>
+              <w:t xml:space="preserve">AI also used to create the list of </w:t>
+            </w:r>
+            <w:proofErr w:type="spellStart"/>
+            <w:r>
+              <w:rPr>
+                <w:color w:val="0F1115"/>
+              </w:rPr>
+              <w:t>Income_Source</w:t>
+            </w:r>
+            <w:proofErr w:type="spellEnd"/>
+            <w:r>
+              <w:rPr>
+                <w:color w:val="0F1115"/>
+              </w:rPr>
+              <w:t xml:space="preserve"> (table Incomes) with 24 different Source of income.</w:t>
             </w:r>
           </w:p>
           <w:p>

</xml_diff>